<commit_message>
chore: remove AI-collaborator references repo-wide
- strip collaborator credit line from all seven project write-up docx
- delete the multi-agent analysis blocks from 4/part2/REQUIREMENTS.md,
  keeping the experimental test log
- remove collaborator line from 4/part2/ALL-PARTS.ipynb header cell
- rename 5/problem3 claude-fix files to problem3-fix and update
  references (paths in PROBLEM3_SOLUTION_MEMORY.md also corrected to
  the real problem3/ subdirectory)
- de-reference assistant config files from both READMEs
- keep working plans local: gitignore docs/plans/
</commit_message>
<xml_diff>
--- a/2/Assign2-StephenPasco.docx
+++ b/2/Assign2-StephenPasco.docx
@@ -38,25 +38,6 @@
           <w:szCs w:val="24"/>
         </w:rPr>
         <w:t>Stephen Pasco</w:t>
-      </w:r>
-    </w:p>
-    <w:p>
-      <w:pPr>
-        <w:rPr>
-          <w:rFonts w:ascii="Courier New" w:hAnsi="Courier New" w:cs="Courier New"/>
-          <w:smallCaps/>
-          <w:sz w:val="24"/>
-          <w:szCs w:val="24"/>
-        </w:rPr>
-      </w:pPr>
-      <w:r>
-        <w:rPr>
-          <w:rFonts w:ascii="Courier New" w:hAnsi="Courier New" w:cs="Courier New"/>
-          <w:smallCaps/>
-          <w:sz w:val="24"/>
-          <w:szCs w:val="24"/>
-        </w:rPr>
-        <w:t>Collaborators: Google Gemini Flash for Q&amp;A – Understanding tasks, Kera API options</w:t>
       </w:r>
     </w:p>
     <w:p>

</xml_diff>